<commit_message>
Replace useless login-page figures with real logged-in UI screenshots
The prior upgrade figures were duplicate login pages (identical md5) that
did not show versions or upgrade result. Replaced with real UI proof:
- vCenter VAMI Summary: Version 9.1.0.0300 build 25629530, health Good
- ESXi Host Client: ESXi 9.1.0.0100.25433460 on Broadwell E5-2682 v4
- NSX 9.1 logged-in UI (VPCs tab, managed by VCF Operations)
Rebuilt VCF-5.2.1-to-9.1-Rebuild-Report.docx with these embedded.

Co-Authored-By: Claude Opus 4.8 <noreply@anthropic.com>
</commit_message>
<xml_diff>
--- a/doc/VCF-5.2.1-to-9.1-Rebuild-Report.docx
+++ b/doc/VCF-5.2.1-to-9.1-Rebuild-Report.docx
@@ -1267,7 +1267,7 @@
       <w:r>
         <w:drawing>
           <wp:inline xmlns:a="http://schemas.openxmlformats.org/drawingml/2006/main" xmlns:pic="http://schemas.openxmlformats.org/drawingml/2006/picture">
-            <wp:extent cx="5760720" cy="3240405"/>
+            <wp:extent cx="5760720" cy="2723977"/>
             <wp:docPr id="4" name="Picture 4"/>
             <wp:cNvGraphicFramePr>
               <a:graphicFrameLocks noChangeAspect="1"/>
@@ -1276,7 +1276,7 @@
               <a:graphicData uri="http://schemas.openxmlformats.org/drawingml/2006/picture">
                 <pic:pic>
                   <pic:nvPicPr>
-                    <pic:cNvPr id="0" name="p5-nsx-before-421.png"/>
+                    <pic:cNvPr id="0" name="ui-nsx-landing.png"/>
                     <pic:cNvPicPr/>
                   </pic:nvPicPr>
                   <pic:blipFill>
@@ -1288,7 +1288,7 @@
                   <pic:spPr>
                     <a:xfrm>
                       <a:off x="0" y="0"/>
-                      <a:ext cx="5760720" cy="3240405"/>
+                      <a:ext cx="5760720" cy="2723977"/>
                     </a:xfrm>
                     <a:prstGeom prst="rect"/>
                   </pic:spPr>
@@ -1309,163 +1309,7 @@
           <w:i/>
           <w:sz w:val="18"/>
         </w:rPr>
-        <w:t>圖：升級前：NSX Manager 4.2.1</w:t>
-      </w:r>
-    </w:p>
-    <w:p>
-      <w:pPr>
-        <w:jc w:val="center"/>
-      </w:pPr>
-      <w:r>
-        <w:drawing>
-          <wp:inline xmlns:a="http://schemas.openxmlformats.org/drawingml/2006/main" xmlns:pic="http://schemas.openxmlformats.org/drawingml/2006/picture">
-            <wp:extent cx="5760720" cy="3240405"/>
-            <wp:docPr id="5" name="Picture 5"/>
-            <wp:cNvGraphicFramePr>
-              <a:graphicFrameLocks noChangeAspect="1"/>
-            </wp:cNvGraphicFramePr>
-            <a:graphic>
-              <a:graphicData uri="http://schemas.openxmlformats.org/drawingml/2006/picture">
-                <pic:pic>
-                  <pic:nvPicPr>
-                    <pic:cNvPr id="0" name="p5-nsx-before-421.png"/>
-                    <pic:cNvPicPr/>
-                  </pic:nvPicPr>
-                  <pic:blipFill>
-                    <a:blip r:embed="rId12"/>
-                    <a:stretch>
-                      <a:fillRect/>
-                    </a:stretch>
-                  </pic:blipFill>
-                  <pic:spPr>
-                    <a:xfrm>
-                      <a:off x="0" y="0"/>
-                      <a:ext cx="5760720" cy="3240405"/>
-                    </a:xfrm>
-                    <a:prstGeom prst="rect"/>
-                  </pic:spPr>
-                </pic:pic>
-              </a:graphicData>
-            </a:graphic>
-          </wp:inline>
-        </w:drawing>
-      </w:r>
-    </w:p>
-    <w:p>
-      <w:pPr>
-        <w:jc w:val="center"/>
-      </w:pPr>
-      <w:r>
-        <w:rPr>
-          <w:rFonts w:ascii="Calibri" w:hAnsi="Calibri" w:eastAsia="Microsoft JhengHei"/>
-          <w:i/>
-          <w:sz w:val="18"/>
-        </w:rPr>
-        <w:t>圖：NSX MP（Manager）升級完成 → 9.1.0.0200</w:t>
-      </w:r>
-    </w:p>
-    <w:p>
-      <w:pPr>
-        <w:jc w:val="center"/>
-      </w:pPr>
-      <w:r>
-        <w:drawing>
-          <wp:inline xmlns:a="http://schemas.openxmlformats.org/drawingml/2006/main" xmlns:pic="http://schemas.openxmlformats.org/drawingml/2006/picture">
-            <wp:extent cx="5760720" cy="3240405"/>
-            <wp:docPr id="6" name="Picture 6"/>
-            <wp:cNvGraphicFramePr>
-              <a:graphicFrameLocks noChangeAspect="1"/>
-            </wp:cNvGraphicFramePr>
-            <a:graphic>
-              <a:graphicData uri="http://schemas.openxmlformats.org/drawingml/2006/picture">
-                <pic:pic>
-                  <pic:nvPicPr>
-                    <pic:cNvPr id="0" name="p5-nsx-before-421.png"/>
-                    <pic:cNvPicPr/>
-                  </pic:nvPicPr>
-                  <pic:blipFill>
-                    <a:blip r:embed="rId12"/>
-                    <a:stretch>
-                      <a:fillRect/>
-                    </a:stretch>
-                  </pic:blipFill>
-                  <pic:spPr>
-                    <a:xfrm>
-                      <a:off x="0" y="0"/>
-                      <a:ext cx="5760720" cy="3240405"/>
-                    </a:xfrm>
-                    <a:prstGeom prst="rect"/>
-                  </pic:spPr>
-                </pic:pic>
-              </a:graphicData>
-            </a:graphic>
-          </wp:inline>
-        </w:drawing>
-      </w:r>
-    </w:p>
-    <w:p>
-      <w:pPr>
-        <w:jc w:val="center"/>
-      </w:pPr>
-      <w:r>
-        <w:rPr>
-          <w:rFonts w:ascii="Calibri" w:hAnsi="Calibri" w:eastAsia="Microsoft JhengHei"/>
-          <w:i/>
-          <w:sz w:val="18"/>
-        </w:rPr>
-        <w:t>圖：NSX Host VIB ×4 升級完成（9.1.0.0200，vSAN resync=0）</w:t>
-      </w:r>
-    </w:p>
-    <w:p>
-      <w:pPr>
-        <w:jc w:val="center"/>
-      </w:pPr>
-      <w:r>
-        <w:drawing>
-          <wp:inline xmlns:a="http://schemas.openxmlformats.org/drawingml/2006/main" xmlns:pic="http://schemas.openxmlformats.org/drawingml/2006/picture">
-            <wp:extent cx="5760720" cy="3240405"/>
-            <wp:docPr id="7" name="Picture 7"/>
-            <wp:cNvGraphicFramePr>
-              <a:graphicFrameLocks noChangeAspect="1"/>
-            </wp:cNvGraphicFramePr>
-            <a:graphic>
-              <a:graphicData uri="http://schemas.openxmlformats.org/drawingml/2006/picture">
-                <pic:pic>
-                  <pic:nvPicPr>
-                    <pic:cNvPr id="0" name="p5-nsx-final-91.png"/>
-                    <pic:cNvPicPr/>
-                  </pic:nvPicPr>
-                  <pic:blipFill>
-                    <a:blip r:embed="rId13"/>
-                    <a:stretch>
-                      <a:fillRect/>
-                    </a:stretch>
-                  </pic:blipFill>
-                  <pic:spPr>
-                    <a:xfrm>
-                      <a:off x="0" y="0"/>
-                      <a:ext cx="5760720" cy="3240405"/>
-                    </a:xfrm>
-                    <a:prstGeom prst="rect"/>
-                  </pic:spPr>
-                </pic:pic>
-              </a:graphicData>
-            </a:graphic>
-          </wp:inline>
-        </w:drawing>
-      </w:r>
-    </w:p>
-    <w:p>
-      <w:pPr>
-        <w:jc w:val="center"/>
-      </w:pPr>
-      <w:r>
-        <w:rPr>
-          <w:rFonts w:ascii="Calibri" w:hAnsi="Calibri" w:eastAsia="Microsoft JhengHei"/>
-          <w:i/>
-          <w:sz w:val="18"/>
-        </w:rPr>
-        <w:t>圖：NSX Finalize 完成 → product_version 9.1.0.0200</w:t>
+        <w:t>圖：升級後：登入 NSX 9.1 UI（VPCs 分頁 / 現代版面 / “managed by VCF Operations” 橫幅為 9.1 特徵；REST API 回報 node/product 9.1.0.0200.25524170，MP/Host×4/Finalize 全 SUCCESS）</w:t>
       </w:r>
     </w:p>
     <w:p>
@@ -1521,8 +1365,8 @@
       <w:r>
         <w:drawing>
           <wp:inline xmlns:a="http://schemas.openxmlformats.org/drawingml/2006/main" xmlns:pic="http://schemas.openxmlformats.org/drawingml/2006/picture">
-            <wp:extent cx="5760720" cy="3240405"/>
-            <wp:docPr id="8" name="Picture 8"/>
+            <wp:extent cx="5760720" cy="2723977"/>
+            <wp:docPr id="5" name="Picture 5"/>
             <wp:cNvGraphicFramePr>
               <a:graphicFrameLocks noChangeAspect="1"/>
             </wp:cNvGraphicFramePr>
@@ -1530,11 +1374,11 @@
               <a:graphicData uri="http://schemas.openxmlformats.org/drawingml/2006/picture">
                 <pic:pic>
                   <pic:nvPicPr>
-                    <pic:cNvPr id="0" name="p5-vcenter-91.png"/>
+                    <pic:cNvPr id="0" name="ui-vcenter-vami.png"/>
                     <pic:cNvPicPr/>
                   </pic:nvPicPr>
                   <pic:blipFill>
-                    <a:blip r:embed="rId14"/>
+                    <a:blip r:embed="rId13"/>
                     <a:stretch>
                       <a:fillRect/>
                     </a:stretch>
@@ -1542,7 +1386,7 @@
                   <pic:spPr>
                     <a:xfrm>
                       <a:off x="0" y="0"/>
-                      <a:ext cx="5760720" cy="3240405"/>
+                      <a:ext cx="5760720" cy="2723977"/>
                     </a:xfrm>
                     <a:prstGeom prst="rect"/>
                   </pic:spPr>
@@ -1563,7 +1407,7 @@
           <w:i/>
           <w:sz w:val="18"/>
         </w:rPr>
-        <w:t>圖：vCenter 9.1.0 build 25629530（migration 後於 .142）</w:t>
+        <w:t>圖：升級後：vCenter VAMI Summary — Version 9.1.0.0300 / Build 25629530，Health 全 Good，SSO Running</w:t>
       </w:r>
     </w:p>
     <w:p>
@@ -1645,6 +1489,58 @@
           <w:sz w:val="21"/>
         </w:rPr>
         <w:t>每台升級前以 vCenter 重新啟用 SSH（reboot 後預設關）。</w:t>
+      </w:r>
+    </w:p>
+    <w:p>
+      <w:pPr>
+        <w:jc w:val="center"/>
+      </w:pPr>
+      <w:r>
+        <w:drawing>
+          <wp:inline xmlns:a="http://schemas.openxmlformats.org/drawingml/2006/main" xmlns:pic="http://schemas.openxmlformats.org/drawingml/2006/picture">
+            <wp:extent cx="5760720" cy="2723977"/>
+            <wp:docPr id="6" name="Picture 6"/>
+            <wp:cNvGraphicFramePr>
+              <a:graphicFrameLocks noChangeAspect="1"/>
+            </wp:cNvGraphicFramePr>
+            <a:graphic>
+              <a:graphicData uri="http://schemas.openxmlformats.org/drawingml/2006/picture">
+                <pic:pic>
+                  <pic:nvPicPr>
+                    <pic:cNvPr id="0" name="ui-esxi01-91.png"/>
+                    <pic:cNvPicPr/>
+                  </pic:nvPicPr>
+                  <pic:blipFill>
+                    <a:blip r:embed="rId14"/>
+                    <a:stretch>
+                      <a:fillRect/>
+                    </a:stretch>
+                  </pic:blipFill>
+                  <pic:spPr>
+                    <a:xfrm>
+                      <a:off x="0" y="0"/>
+                      <a:ext cx="5760720" cy="2723977"/>
+                    </a:xfrm>
+                    <a:prstGeom prst="rect"/>
+                  </pic:spPr>
+                </pic:pic>
+              </a:graphicData>
+            </a:graphic>
+          </wp:inline>
+        </w:drawing>
+      </w:r>
+    </w:p>
+    <w:p>
+      <w:pPr>
+        <w:jc w:val="center"/>
+      </w:pPr>
+      <w:r>
+        <w:rPr>
+          <w:rFonts w:ascii="Calibri" w:hAnsi="Calibri" w:eastAsia="Microsoft JhengHei"/>
+          <w:i/>
+          <w:sz w:val="18"/>
+        </w:rPr>
+        <w:t>圖：升級後：ESXi Host Client — Hypervisor VMware ESXi 9.1.0.0100.25433460，Processor Intel Xeon E5-2682 v4（Broadwell，VCF9 列 discontinued，本法成功升級並開機）</w:t>
       </w:r>
     </w:p>
     <w:tbl>
@@ -1834,7 +1730,7 @@
         <w:drawing>
           <wp:inline xmlns:a="http://schemas.openxmlformats.org/drawingml/2006/main" xmlns:pic="http://schemas.openxmlformats.org/drawingml/2006/picture">
             <wp:extent cx="5760720" cy="3240405"/>
-            <wp:docPr id="9" name="Picture 9"/>
+            <wp:docPr id="7" name="Picture 7"/>
             <wp:cNvGraphicFramePr>
               <a:graphicFrameLocks noChangeAspect="1"/>
             </wp:cNvGraphicFramePr>
@@ -1886,7 +1782,7 @@
         <w:drawing>
           <wp:inline xmlns:a="http://schemas.openxmlformats.org/drawingml/2006/main" xmlns:pic="http://schemas.openxmlformats.org/drawingml/2006/picture">
             <wp:extent cx="5760720" cy="2723977"/>
-            <wp:docPr id="10" name="Picture 10"/>
+            <wp:docPr id="8" name="Picture 8"/>
             <wp:cNvGraphicFramePr>
               <a:graphicFrameLocks noChangeAspect="1"/>
             </wp:cNvGraphicFramePr>
@@ -2007,7 +1903,7 @@
         <w:drawing>
           <wp:inline xmlns:a="http://schemas.openxmlformats.org/drawingml/2006/main" xmlns:pic="http://schemas.openxmlformats.org/drawingml/2006/picture">
             <wp:extent cx="5760720" cy="4320540"/>
-            <wp:docPr id="11" name="Picture 11"/>
+            <wp:docPr id="9" name="Picture 9"/>
             <wp:cNvGraphicFramePr>
               <a:graphicFrameLocks noChangeAspect="1"/>
             </wp:cNvGraphicFramePr>

</xml_diff>

<commit_message>
Rebuild #2: real step-by-step upgrade UI screenshots (NSX Upgrade Coordinator)
User wanted live step-by-step upgrade UI. Full rebuild from 5.2.1 again,
this time capturing the NSX in-app Upgrade page (System > Upgrade) at each
phase - the standalone /upgrade-coordinator/ iframe renders blank under
automation (XSRF + zh-TW locale), so used /nsx/index.html#/app/system/home/
upgrade/home/summary via headless CDP (English locale):
- up01 NSX 4.2.1 start, up05 MP done, up06 Host In Progress,
  up07 Host done, up11 all Complete (all 6 steps green-checked, 9.1.0.0200)
- up08 vCenter VAMI 9.1.0.0300, up09 ESXi console 9.1 on Broadwell,
  up10 ESXi host client, up12 Ops login/dashboard, up13 License console
Rebuilt docx with these step-by-step UI figures. All passwords placeholdered.

Co-Authored-By: Claude Opus 4.8 <noreply@anthropic.com>
</commit_message>
<xml_diff>
--- a/doc/VCF-5.2.1-to-9.1-Rebuild-Report.docx
+++ b/doc/VCF-5.2.1-to-9.1-Rebuild-Report.docx
@@ -1261,13 +1261,24 @@
       </w:r>
     </w:p>
     <w:p>
+      <w:r>
+        <w:rPr>
+          <w:rFonts w:ascii="Calibri" w:hAnsi="Calibri" w:eastAsia="Microsoft JhengHei"/>
+          <w:b/>
+          <w:i w:val="0"/>
+          <w:sz w:val="21"/>
+        </w:rPr>
+        <w:t>以下為 NSX Upgrade Coordinator（System → Upgrade）的逐步實機畫面：</w:t>
+      </w:r>
+    </w:p>
+    <w:p>
       <w:pPr>
         <w:jc w:val="center"/>
       </w:pPr>
       <w:r>
         <w:drawing>
           <wp:inline xmlns:a="http://schemas.openxmlformats.org/drawingml/2006/main" xmlns:pic="http://schemas.openxmlformats.org/drawingml/2006/picture">
-            <wp:extent cx="5760720" cy="2723977"/>
+            <wp:extent cx="5029200" cy="2378075"/>
             <wp:docPr id="4" name="Picture 4"/>
             <wp:cNvGraphicFramePr>
               <a:graphicFrameLocks noChangeAspect="1"/>
@@ -1276,7 +1287,7 @@
               <a:graphicData uri="http://schemas.openxmlformats.org/drawingml/2006/picture">
                 <pic:pic>
                   <pic:nvPicPr>
-                    <pic:cNvPr id="0" name="ui-nsx-landing.png"/>
+                    <pic:cNvPr id="0" name="up01-nsx-before-421.png"/>
                     <pic:cNvPicPr/>
                   </pic:nvPicPr>
                   <pic:blipFill>
@@ -1288,7 +1299,7 @@
                   <pic:spPr>
                     <a:xfrm>
                       <a:off x="0" y="0"/>
-                      <a:ext cx="5760720" cy="2723977"/>
+                      <a:ext cx="5029200" cy="2378075"/>
                     </a:xfrm>
                     <a:prstGeom prst="rect"/>
                   </pic:spPr>
@@ -1309,7 +1320,215 @@
           <w:i/>
           <w:sz w:val="18"/>
         </w:rPr>
-        <w:t>圖：升級後：登入 NSX 9.1 UI（VPCs 分頁 / 現代版面 / “managed by VCF Operations” 橫幅為 9.1 特徵；REST API 回報 node/product 9.1.0.0200.25524170，MP/Host×4/Finalize 全 SUCCESS）</w:t>
+        <w:t>圖：① 升級前：NSX 4.2.1，Upgrade Coordinator 起點（Prepare for Upgrade）</w:t>
+      </w:r>
+    </w:p>
+    <w:p>
+      <w:pPr>
+        <w:jc w:val="center"/>
+      </w:pPr>
+      <w:r>
+        <w:drawing>
+          <wp:inline xmlns:a="http://schemas.openxmlformats.org/drawingml/2006/main" xmlns:pic="http://schemas.openxmlformats.org/drawingml/2006/picture">
+            <wp:extent cx="5029200" cy="2378075"/>
+            <wp:docPr id="5" name="Picture 5"/>
+            <wp:cNvGraphicFramePr>
+              <a:graphicFrameLocks noChangeAspect="1"/>
+            </wp:cNvGraphicFramePr>
+            <a:graphic>
+              <a:graphicData uri="http://schemas.openxmlformats.org/drawingml/2006/picture">
+                <pic:pic>
+                  <pic:nvPicPr>
+                    <pic:cNvPr id="0" name="up05-mp-done.png"/>
+                    <pic:cNvPicPr/>
+                  </pic:nvPicPr>
+                  <pic:blipFill>
+                    <a:blip r:embed="rId13"/>
+                    <a:stretch>
+                      <a:fillRect/>
+                    </a:stretch>
+                  </pic:blipFill>
+                  <pic:spPr>
+                    <a:xfrm>
+                      <a:off x="0" y="0"/>
+                      <a:ext cx="5029200" cy="2378075"/>
+                    </a:xfrm>
+                    <a:prstGeom prst="rect"/>
+                  </pic:spPr>
+                </pic:pic>
+              </a:graphicData>
+            </a:graphic>
+          </wp:inline>
+        </w:drawing>
+      </w:r>
+    </w:p>
+    <w:p>
+      <w:pPr>
+        <w:jc w:val="center"/>
+      </w:pPr>
+      <w:r>
+        <w:rPr>
+          <w:rFonts w:ascii="Calibri" w:hAnsi="Calibri" w:eastAsia="Microsoft JhengHei"/>
+          <w:i/>
+          <w:sz w:val="18"/>
+        </w:rPr>
+        <w:t>圖：② UPGRADE SUMMARY：Prepare ✅、Upgrade NSX Manager ✅（MP 完成，Target 9.1.0.0200.25524170）</w:t>
+      </w:r>
+    </w:p>
+    <w:p>
+      <w:pPr>
+        <w:jc w:val="center"/>
+      </w:pPr>
+      <w:r>
+        <w:drawing>
+          <wp:inline xmlns:a="http://schemas.openxmlformats.org/drawingml/2006/main" xmlns:pic="http://schemas.openxmlformats.org/drawingml/2006/picture">
+            <wp:extent cx="5029200" cy="2378075"/>
+            <wp:docPr id="6" name="Picture 6"/>
+            <wp:cNvGraphicFramePr>
+              <a:graphicFrameLocks noChangeAspect="1"/>
+            </wp:cNvGraphicFramePr>
+            <a:graphic>
+              <a:graphicData uri="http://schemas.openxmlformats.org/drawingml/2006/picture">
+                <pic:pic>
+                  <pic:nvPicPr>
+                    <pic:cNvPr id="0" name="up06-host-progress.png"/>
+                    <pic:cNvPicPr/>
+                  </pic:nvPicPr>
+                  <pic:blipFill>
+                    <a:blip r:embed="rId14"/>
+                    <a:stretch>
+                      <a:fillRect/>
+                    </a:stretch>
+                  </pic:blipFill>
+                  <pic:spPr>
+                    <a:xfrm>
+                      <a:off x="0" y="0"/>
+                      <a:ext cx="5029200" cy="2378075"/>
+                    </a:xfrm>
+                    <a:prstGeom prst="rect"/>
+                  </pic:spPr>
+                </pic:pic>
+              </a:graphicData>
+            </a:graphic>
+          </wp:inline>
+        </w:drawing>
+      </w:r>
+    </w:p>
+    <w:p>
+      <w:pPr>
+        <w:jc w:val="center"/>
+      </w:pPr>
+      <w:r>
+        <w:rPr>
+          <w:rFonts w:ascii="Calibri" w:hAnsi="Calibri" w:eastAsia="Microsoft JhengHei"/>
+          <w:i/>
+          <w:sz w:val="18"/>
+        </w:rPr>
+        <w:t>圖：③ Upgrade Hosts 進行中（右上 “In Progress” 徽章）</w:t>
+      </w:r>
+    </w:p>
+    <w:p>
+      <w:pPr>
+        <w:jc w:val="center"/>
+      </w:pPr>
+      <w:r>
+        <w:drawing>
+          <wp:inline xmlns:a="http://schemas.openxmlformats.org/drawingml/2006/main" xmlns:pic="http://schemas.openxmlformats.org/drawingml/2006/picture">
+            <wp:extent cx="4572000" cy="3385868"/>
+            <wp:docPr id="7" name="Picture 7"/>
+            <wp:cNvGraphicFramePr>
+              <a:graphicFrameLocks noChangeAspect="1"/>
+            </wp:cNvGraphicFramePr>
+            <a:graphic>
+              <a:graphicData uri="http://schemas.openxmlformats.org/drawingml/2006/picture">
+                <pic:pic>
+                  <pic:nvPicPr>
+                    <pic:cNvPr id="0" name="up07-host-done.png"/>
+                    <pic:cNvPicPr/>
+                  </pic:nvPicPr>
+                  <pic:blipFill>
+                    <a:blip r:embed="rId15"/>
+                    <a:stretch>
+                      <a:fillRect/>
+                    </a:stretch>
+                  </pic:blipFill>
+                  <pic:spPr>
+                    <a:xfrm>
+                      <a:off x="0" y="0"/>
+                      <a:ext cx="4572000" cy="3385868"/>
+                    </a:xfrm>
+                    <a:prstGeom prst="rect"/>
+                  </pic:spPr>
+                </pic:pic>
+              </a:graphicData>
+            </a:graphic>
+          </wp:inline>
+        </w:drawing>
+      </w:r>
+    </w:p>
+    <w:p>
+      <w:pPr>
+        <w:jc w:val="center"/>
+      </w:pPr>
+      <w:r>
+        <w:rPr>
+          <w:rFonts w:ascii="Calibri" w:hAnsi="Calibri" w:eastAsia="Microsoft JhengHei"/>
+          <w:i/>
+          <w:sz w:val="18"/>
+        </w:rPr>
+        <w:t>圖：④ Upgrade Hosts ✅（MP + Hosts 完成，Edges/Finalize 待續）</w:t>
+      </w:r>
+    </w:p>
+    <w:p>
+      <w:pPr>
+        <w:jc w:val="center"/>
+      </w:pPr>
+      <w:r>
+        <w:drawing>
+          <wp:inline xmlns:a="http://schemas.openxmlformats.org/drawingml/2006/main" xmlns:pic="http://schemas.openxmlformats.org/drawingml/2006/picture">
+            <wp:extent cx="4572000" cy="3385868"/>
+            <wp:docPr id="8" name="Picture 8"/>
+            <wp:cNvGraphicFramePr>
+              <a:graphicFrameLocks noChangeAspect="1"/>
+            </wp:cNvGraphicFramePr>
+            <a:graphic>
+              <a:graphicData uri="http://schemas.openxmlformats.org/drawingml/2006/picture">
+                <pic:pic>
+                  <pic:nvPicPr>
+                    <pic:cNvPr id="0" name="up11-all-done.png"/>
+                    <pic:cNvPicPr/>
+                  </pic:nvPicPr>
+                  <pic:blipFill>
+                    <a:blip r:embed="rId16"/>
+                    <a:stretch>
+                      <a:fillRect/>
+                    </a:stretch>
+                  </pic:blipFill>
+                  <pic:spPr>
+                    <a:xfrm>
+                      <a:off x="0" y="0"/>
+                      <a:ext cx="4572000" cy="3385868"/>
+                    </a:xfrm>
+                    <a:prstGeom prst="rect"/>
+                  </pic:spPr>
+                </pic:pic>
+              </a:graphicData>
+            </a:graphic>
+          </wp:inline>
+        </w:drawing>
+      </w:r>
+    </w:p>
+    <w:p>
+      <w:pPr>
+        <w:jc w:val="center"/>
+      </w:pPr>
+      <w:r>
+        <w:rPr>
+          <w:rFonts w:ascii="Calibri" w:hAnsi="Calibri" w:eastAsia="Microsoft JhengHei"/>
+          <w:i/>
+          <w:sz w:val="18"/>
+        </w:rPr>
+        <w:t>圖：⑤ 升級完成：“Complete” 徽章，Check Readiness / Prepare / NSX Manager / Hosts / Edges &amp; VNAs / Finalize 全 ✅，版本 9.1.0.0200.25524170</w:t>
       </w:r>
     </w:p>
     <w:p>
@@ -1365,8 +1584,8 @@
       <w:r>
         <w:drawing>
           <wp:inline xmlns:a="http://schemas.openxmlformats.org/drawingml/2006/main" xmlns:pic="http://schemas.openxmlformats.org/drawingml/2006/picture">
-            <wp:extent cx="5760720" cy="2723977"/>
-            <wp:docPr id="5" name="Picture 5"/>
+            <wp:extent cx="5760720" cy="4266194"/>
+            <wp:docPr id="9" name="Picture 9"/>
             <wp:cNvGraphicFramePr>
               <a:graphicFrameLocks noChangeAspect="1"/>
             </wp:cNvGraphicFramePr>
@@ -1374,11 +1593,11 @@
               <a:graphicData uri="http://schemas.openxmlformats.org/drawingml/2006/picture">
                 <pic:pic>
                   <pic:nvPicPr>
-                    <pic:cNvPr id="0" name="ui-vcenter-vami.png"/>
+                    <pic:cNvPr id="0" name="up08-vcenter-vami-91.png"/>
                     <pic:cNvPicPr/>
                   </pic:nvPicPr>
                   <pic:blipFill>
-                    <a:blip r:embed="rId13"/>
+                    <a:blip r:embed="rId17"/>
                     <a:stretch>
                       <a:fillRect/>
                     </a:stretch>
@@ -1386,7 +1605,7 @@
                   <pic:spPr>
                     <a:xfrm>
                       <a:off x="0" y="0"/>
-                      <a:ext cx="5760720" cy="2723977"/>
+                      <a:ext cx="5760720" cy="4266194"/>
                     </a:xfrm>
                     <a:prstGeom prst="rect"/>
                   </pic:spPr>
@@ -1498,8 +1717,8 @@
       <w:r>
         <w:drawing>
           <wp:inline xmlns:a="http://schemas.openxmlformats.org/drawingml/2006/main" xmlns:pic="http://schemas.openxmlformats.org/drawingml/2006/picture">
-            <wp:extent cx="5760720" cy="2723977"/>
-            <wp:docPr id="6" name="Picture 6"/>
+            <wp:extent cx="5029200" cy="3771900"/>
+            <wp:docPr id="10" name="Picture 10"/>
             <wp:cNvGraphicFramePr>
               <a:graphicFrameLocks noChangeAspect="1"/>
             </wp:cNvGraphicFramePr>
@@ -1507,11 +1726,11 @@
               <a:graphicData uri="http://schemas.openxmlformats.org/drawingml/2006/picture">
                 <pic:pic>
                   <pic:nvPicPr>
-                    <pic:cNvPr id="0" name="ui-esxi01-91.png"/>
+                    <pic:cNvPr id="0" name="up09-esxi91-console.png"/>
                     <pic:cNvPicPr/>
                   </pic:nvPicPr>
                   <pic:blipFill>
-                    <a:blip r:embed="rId14"/>
+                    <a:blip r:embed="rId18"/>
                     <a:stretch>
                       <a:fillRect/>
                     </a:stretch>
@@ -1519,7 +1738,7 @@
                   <pic:spPr>
                     <a:xfrm>
                       <a:off x="0" y="0"/>
-                      <a:ext cx="5760720" cy="2723977"/>
+                      <a:ext cx="5029200" cy="3771900"/>
                     </a:xfrm>
                     <a:prstGeom prst="rect"/>
                   </pic:spPr>
@@ -1540,7 +1759,59 @@
           <w:i/>
           <w:sz w:val="18"/>
         </w:rPr>
-        <w:t>圖：升級後：ESXi Host Client — Hypervisor VMware ESXi 9.1.0.0100.25433460，Processor Intel Xeon E5-2682 v4（Broadwell，VCF9 列 discontinued，本法成功升級並開機）</w:t>
+        <w:t>圖：升級後：ESXi 主控台 DCUI — VMware ESXi 9.1.0.0100.25433460 on Intel Xeon E5-2682 v4（Broadwell，VCF9 列 discontinued，本 profile-install 法成功升級並開機）</w:t>
+      </w:r>
+    </w:p>
+    <w:p>
+      <w:pPr>
+        <w:jc w:val="center"/>
+      </w:pPr>
+      <w:r>
+        <w:drawing>
+          <wp:inline xmlns:a="http://schemas.openxmlformats.org/drawingml/2006/main" xmlns:pic="http://schemas.openxmlformats.org/drawingml/2006/picture">
+            <wp:extent cx="5029200" cy="3724455"/>
+            <wp:docPr id="11" name="Picture 11"/>
+            <wp:cNvGraphicFramePr>
+              <a:graphicFrameLocks noChangeAspect="1"/>
+            </wp:cNvGraphicFramePr>
+            <a:graphic>
+              <a:graphicData uri="http://schemas.openxmlformats.org/drawingml/2006/picture">
+                <pic:pic>
+                  <pic:nvPicPr>
+                    <pic:cNvPr id="0" name="up10-esxi-hostclient-91.png"/>
+                    <pic:cNvPicPr/>
+                  </pic:nvPicPr>
+                  <pic:blipFill>
+                    <a:blip r:embed="rId19"/>
+                    <a:stretch>
+                      <a:fillRect/>
+                    </a:stretch>
+                  </pic:blipFill>
+                  <pic:spPr>
+                    <a:xfrm>
+                      <a:off x="0" y="0"/>
+                      <a:ext cx="5029200" cy="3724455"/>
+                    </a:xfrm>
+                    <a:prstGeom prst="rect"/>
+                  </pic:spPr>
+                </pic:pic>
+              </a:graphicData>
+            </a:graphic>
+          </wp:inline>
+        </w:drawing>
+      </w:r>
+    </w:p>
+    <w:p>
+      <w:pPr>
+        <w:jc w:val="center"/>
+      </w:pPr>
+      <w:r>
+        <w:rPr>
+          <w:rFonts w:ascii="Calibri" w:hAnsi="Calibri" w:eastAsia="Microsoft JhengHei"/>
+          <w:i/>
+          <w:sz w:val="18"/>
+        </w:rPr>
+        <w:t>圖：升級後：ESXi Host Client — Hypervisor VMware ESXi 9.1.0.0100.25433460，Processor Broadwell E5-2682 v4</w:t>
       </w:r>
     </w:p>
     <w:tbl>
@@ -1729,8 +2000,8 @@
       <w:r>
         <w:drawing>
           <wp:inline xmlns:a="http://schemas.openxmlformats.org/drawingml/2006/main" xmlns:pic="http://schemas.openxmlformats.org/drawingml/2006/picture">
-            <wp:extent cx="5760720" cy="3240405"/>
-            <wp:docPr id="7" name="Picture 7"/>
+            <wp:extent cx="5760720" cy="3456432"/>
+            <wp:docPr id="12" name="Picture 12"/>
             <wp:cNvGraphicFramePr>
               <a:graphicFrameLocks noChangeAspect="1"/>
             </wp:cNvGraphicFramePr>
@@ -1738,11 +2009,11 @@
               <a:graphicData uri="http://schemas.openxmlformats.org/drawingml/2006/picture">
                 <pic:pic>
                   <pic:nvPicPr>
-                    <pic:cNvPr id="0" name="p6-ops-login.png"/>
+                    <pic:cNvPr id="0" name="up12-ops-login.png"/>
                     <pic:cNvPicPr/>
                   </pic:nvPicPr>
                   <pic:blipFill>
-                    <a:blip r:embed="rId15"/>
+                    <a:blip r:embed="rId20"/>
                     <a:stretch>
                       <a:fillRect/>
                     </a:stretch>
@@ -1750,7 +2021,7 @@
                   <pic:spPr>
                     <a:xfrm>
                       <a:off x="0" y="0"/>
-                      <a:ext cx="5760720" cy="3240405"/>
+                      <a:ext cx="5760720" cy="3456432"/>
                     </a:xfrm>
                     <a:prstGeom prst="rect"/>
                   </pic:spPr>
@@ -1781,8 +2052,8 @@
       <w:r>
         <w:drawing>
           <wp:inline xmlns:a="http://schemas.openxmlformats.org/drawingml/2006/main" xmlns:pic="http://schemas.openxmlformats.org/drawingml/2006/picture">
-            <wp:extent cx="5760720" cy="2723977"/>
-            <wp:docPr id="8" name="Picture 8"/>
+            <wp:extent cx="5760720" cy="4266194"/>
+            <wp:docPr id="13" name="Picture 13"/>
             <wp:cNvGraphicFramePr>
               <a:graphicFrameLocks noChangeAspect="1"/>
             </wp:cNvGraphicFramePr>
@@ -1790,11 +2061,11 @@
               <a:graphicData uri="http://schemas.openxmlformats.org/drawingml/2006/picture">
                 <pic:pic>
                   <pic:nvPicPr>
-                    <pic:cNvPr id="0" name="p6-ops-dashboard.png"/>
+                    <pic:cNvPr id="0" name="up12-ops-dashboard.png"/>
                     <pic:cNvPicPr/>
                   </pic:nvPicPr>
                   <pic:blipFill>
-                    <a:blip r:embed="rId16"/>
+                    <a:blip r:embed="rId21"/>
                     <a:stretch>
                       <a:fillRect/>
                     </a:stretch>
@@ -1802,7 +2073,7 @@
                   <pic:spPr>
                     <a:xfrm>
                       <a:off x="0" y="0"/>
-                      <a:ext cx="5760720" cy="2723977"/>
+                      <a:ext cx="5760720" cy="4266194"/>
                     </a:xfrm>
                     <a:prstGeom prst="rect"/>
                   </pic:spPr>
@@ -1903,7 +2174,7 @@
         <w:drawing>
           <wp:inline xmlns:a="http://schemas.openxmlformats.org/drawingml/2006/main" xmlns:pic="http://schemas.openxmlformats.org/drawingml/2006/picture">
             <wp:extent cx="5760720" cy="4320540"/>
-            <wp:docPr id="9" name="Picture 9"/>
+            <wp:docPr id="14" name="Picture 14"/>
             <wp:cNvGraphicFramePr>
               <a:graphicFrameLocks noChangeAspect="1"/>
             </wp:cNvGraphicFramePr>
@@ -1911,11 +2182,11 @@
               <a:graphicData uri="http://schemas.openxmlformats.org/drawingml/2006/picture">
                 <pic:pic>
                   <pic:nvPicPr>
-                    <pic:cNvPr id="0" name="p6-lic-console.png"/>
+                    <pic:cNvPr id="0" name="up13-lic-console.png"/>
                     <pic:cNvPicPr/>
                   </pic:nvPicPr>
                   <pic:blipFill>
-                    <a:blip r:embed="rId17"/>
+                    <a:blip r:embed="rId22"/>
                     <a:stretch>
                       <a:fillRect/>
                     </a:stretch>
@@ -1944,7 +2215,7 @@
           <w:i/>
           <w:sz w:val="18"/>
         </w:rPr>
-        <w:t>圖：VCF License Server 開機 — "Started License Server Operator"（.151）</w:t>
+        <w:t>圖：VCF License Server 開機（.151）</w:t>
       </w:r>
     </w:p>
     <w:p>

</xml_diff>

<commit_message>
Add vCenter migration step-by-step table (vcsa-deploy stages)
vCenter upgrade is CLI-driven (vcsa-deploy) with no web UI, so its per-step
record is the CLI stage progression. Added a 7-step table to section 5:
Stage 1 deploy -> Install RPMs -> precheck -> export -> firstboot -> import
-> IP cutover, all SUCCEEDED. Also committed rendered PDF.

Co-Authored-By: Claude Opus 4.8 <noreply@anthropic.com>
</commit_message>
<xml_diff>
--- a/doc/VCF-5.2.1-to-9.1-Rebuild-Report.docx
+++ b/doc/VCF-5.2.1-to-9.1-Rebuild-Report.docx
@@ -1578,6 +1578,531 @@
       </w:r>
     </w:p>
     <w:p>
+      <w:r>
+        <w:rPr>
+          <w:rFonts w:ascii="Calibri" w:hAnsi="Calibri" w:eastAsia="Microsoft JhengHei"/>
+          <w:b/>
+          <w:i w:val="0"/>
+          <w:sz w:val="21"/>
+        </w:rPr>
+        <w:t>vCenter migration 逐步（vcsa-deploy 各階段實際執行結果）：</w:t>
+      </w:r>
+    </w:p>
+    <w:tbl>
+      <w:tblPr>
+        <w:tblStyle w:val="LightGrid-Accent1"/>
+        <w:tblW w:type="auto" w:w="0"/>
+        <w:jc w:val="center"/>
+        <w:tblLook w:firstColumn="1" w:firstRow="1" w:lastColumn="0" w:lastRow="0" w:noHBand="0" w:noVBand="1" w:val="04A0"/>
+      </w:tblPr>
+      <w:tblGrid>
+        <w:gridCol w:w="2160"/>
+        <w:gridCol w:w="2160"/>
+        <w:gridCol w:w="2160"/>
+        <w:gridCol w:w="2160"/>
+      </w:tblGrid>
+      <w:tr>
+        <w:tc>
+          <w:tcPr>
+            <w:tcW w:type="dxa" w:w="2160"/>
+          </w:tcPr>
+          <w:p>
+            <w:r/>
+            <w:r>
+              <w:rPr>
+                <w:rFonts w:ascii="Calibri" w:hAnsi="Calibri" w:eastAsia="Microsoft JhengHei"/>
+                <w:b/>
+                <w:sz w:val="19"/>
+              </w:rPr>
+              <w:t>#</w:t>
+            </w:r>
+          </w:p>
+        </w:tc>
+        <w:tc>
+          <w:tcPr>
+            <w:tcW w:type="dxa" w:w="2160"/>
+          </w:tcPr>
+          <w:p>
+            <w:r/>
+            <w:r>
+              <w:rPr>
+                <w:rFonts w:ascii="Calibri" w:hAnsi="Calibri" w:eastAsia="Microsoft JhengHei"/>
+                <w:b/>
+                <w:sz w:val="19"/>
+              </w:rPr>
+              <w:t>階段 / Task</w:t>
+            </w:r>
+          </w:p>
+        </w:tc>
+        <w:tc>
+          <w:tcPr>
+            <w:tcW w:type="dxa" w:w="2160"/>
+          </w:tcPr>
+          <w:p>
+            <w:r/>
+            <w:r>
+              <w:rPr>
+                <w:rFonts w:ascii="Calibri" w:hAnsi="Calibri" w:eastAsia="Microsoft JhengHei"/>
+                <w:b/>
+                <w:sz w:val="19"/>
+              </w:rPr>
+              <w:t>說明</w:t>
+            </w:r>
+          </w:p>
+        </w:tc>
+        <w:tc>
+          <w:tcPr>
+            <w:tcW w:type="dxa" w:w="2160"/>
+          </w:tcPr>
+          <w:p>
+            <w:r/>
+            <w:r>
+              <w:rPr>
+                <w:rFonts w:ascii="Calibri" w:hAnsi="Calibri" w:eastAsia="Microsoft JhengHei"/>
+                <w:b/>
+                <w:sz w:val="19"/>
+              </w:rPr>
+              <w:t>結果</w:t>
+            </w:r>
+          </w:p>
+        </w:tc>
+      </w:tr>
+      <w:tr>
+        <w:tc>
+          <w:tcPr>
+            <w:tcW w:type="dxa" w:w="2160"/>
+          </w:tcPr>
+          <w:p>
+            <w:r/>
+            <w:r>
+              <w:rPr>
+                <w:rFonts w:ascii="Calibri" w:hAnsi="Calibri" w:eastAsia="Microsoft JhengHei"/>
+                <w:sz w:val="19"/>
+              </w:rPr>
+              <w:t>1</w:t>
+            </w:r>
+          </w:p>
+        </w:tc>
+        <w:tc>
+          <w:tcPr>
+            <w:tcW w:type="dxa" w:w="2160"/>
+          </w:tcPr>
+          <w:p>
+            <w:r/>
+            <w:r>
+              <w:rPr>
+                <w:rFonts w:ascii="Calibri" w:hAnsi="Calibri" w:eastAsia="Microsoft JhengHei"/>
+                <w:sz w:val="19"/>
+              </w:rPr>
+              <w:t>Stage 1：部署新 9.1 appliance</w:t>
+            </w:r>
+          </w:p>
+        </w:tc>
+        <w:tc>
+          <w:tcPr>
+            <w:tcW w:type="dxa" w:w="2160"/>
+          </w:tcPr>
+          <w:p>
+            <w:r/>
+            <w:r>
+              <w:rPr>
+                <w:rFonts w:ascii="Calibri" w:hAnsi="Calibri" w:eastAsia="Microsoft JhengHei"/>
+                <w:sz w:val="19"/>
+              </w:rPr>
+              <w:t>OVF Transfer → Power On，暫時 IP 192.168.110.151</w:t>
+            </w:r>
+          </w:p>
+        </w:tc>
+        <w:tc>
+          <w:tcPr>
+            <w:tcW w:type="dxa" w:w="2160"/>
+          </w:tcPr>
+          <w:p>
+            <w:r/>
+            <w:r>
+              <w:rPr>
+                <w:rFonts w:ascii="Calibri" w:hAnsi="Calibri" w:eastAsia="Microsoft JhengHei"/>
+                <w:sz w:val="19"/>
+              </w:rPr>
+              <w:t>完成</w:t>
+            </w:r>
+          </w:p>
+        </w:tc>
+      </w:tr>
+      <w:tr>
+        <w:tc>
+          <w:tcPr>
+            <w:tcW w:type="dxa" w:w="2160"/>
+          </w:tcPr>
+          <w:p>
+            <w:r/>
+            <w:r>
+              <w:rPr>
+                <w:rFonts w:ascii="Calibri" w:hAnsi="Calibri" w:eastAsia="Microsoft JhengHei"/>
+                <w:sz w:val="19"/>
+              </w:rPr>
+              <w:t>2</w:t>
+            </w:r>
+          </w:p>
+        </w:tc>
+        <w:tc>
+          <w:tcPr>
+            <w:tcW w:type="dxa" w:w="2160"/>
+          </w:tcPr>
+          <w:p>
+            <w:r/>
+            <w:r>
+              <w:rPr>
+                <w:rFonts w:ascii="Calibri" w:hAnsi="Calibri" w:eastAsia="Microsoft JhengHei"/>
+                <w:sz w:val="19"/>
+              </w:rPr>
+              <w:t>Install required RPMs</w:t>
+            </w:r>
+          </w:p>
+        </w:tc>
+        <w:tc>
+          <w:tcPr>
+            <w:tcW w:type="dxa" w:w="2160"/>
+          </w:tcPr>
+          <w:p>
+            <w:r/>
+            <w:r>
+              <w:rPr>
+                <w:rFonts w:ascii="Calibri" w:hAnsi="Calibri" w:eastAsia="Microsoft JhengHei"/>
+                <w:sz w:val="19"/>
+              </w:rPr>
+              <w:t>在新 appliance 安裝所需 RPM</w:t>
+            </w:r>
+          </w:p>
+        </w:tc>
+        <w:tc>
+          <w:tcPr>
+            <w:tcW w:type="dxa" w:w="2160"/>
+          </w:tcPr>
+          <w:p>
+            <w:r/>
+            <w:r>
+              <w:rPr>
+                <w:rFonts w:ascii="Calibri" w:hAnsi="Calibri" w:eastAsia="Microsoft JhengHei"/>
+                <w:sz w:val="19"/>
+              </w:rPr>
+              <w:t>SUCCEEDED 100/100</w:t>
+            </w:r>
+          </w:p>
+        </w:tc>
+      </w:tr>
+      <w:tr>
+        <w:tc>
+          <w:tcPr>
+            <w:tcW w:type="dxa" w:w="2160"/>
+          </w:tcPr>
+          <w:p>
+            <w:r/>
+            <w:r>
+              <w:rPr>
+                <w:rFonts w:ascii="Calibri" w:hAnsi="Calibri" w:eastAsia="Microsoft JhengHei"/>
+                <w:sz w:val="19"/>
+              </w:rPr>
+              <w:t>3</w:t>
+            </w:r>
+          </w:p>
+        </w:tc>
+        <w:tc>
+          <w:tcPr>
+            <w:tcW w:type="dxa" w:w="2160"/>
+          </w:tcPr>
+          <w:p>
+            <w:r/>
+            <w:r>
+              <w:rPr>
+                <w:rFonts w:ascii="Calibri" w:hAnsi="Calibri" w:eastAsia="Microsoft JhengHei"/>
+                <w:sz w:val="19"/>
+              </w:rPr>
+              <w:t>Run appliance precheck</w:t>
+            </w:r>
+          </w:p>
+        </w:tc>
+        <w:tc>
+          <w:tcPr>
+            <w:tcW w:type="dxa" w:w="2160"/>
+          </w:tcPr>
+          <w:p>
+            <w:r/>
+            <w:r>
+              <w:rPr>
+                <w:rFonts w:ascii="Calibri" w:hAnsi="Calibri" w:eastAsia="Microsoft JhengHei"/>
+                <w:sz w:val="19"/>
+              </w:rPr>
+              <w:t>升級前檢查</w:t>
+            </w:r>
+          </w:p>
+        </w:tc>
+        <w:tc>
+          <w:tcPr>
+            <w:tcW w:type="dxa" w:w="2160"/>
+          </w:tcPr>
+          <w:p>
+            <w:r/>
+            <w:r>
+              <w:rPr>
+                <w:rFonts w:ascii="Calibri" w:hAnsi="Calibri" w:eastAsia="Microsoft JhengHei"/>
+                <w:sz w:val="19"/>
+              </w:rPr>
+              <w:t>SUCCEEDED 100/100</w:t>
+            </w:r>
+          </w:p>
+        </w:tc>
+      </w:tr>
+      <w:tr>
+        <w:tc>
+          <w:tcPr>
+            <w:tcW w:type="dxa" w:w="2160"/>
+          </w:tcPr>
+          <w:p>
+            <w:r/>
+            <w:r>
+              <w:rPr>
+                <w:rFonts w:ascii="Calibri" w:hAnsi="Calibri" w:eastAsia="Microsoft JhengHei"/>
+                <w:sz w:val="19"/>
+              </w:rPr>
+              <w:t>4</w:t>
+            </w:r>
+          </w:p>
+        </w:tc>
+        <w:tc>
+          <w:tcPr>
+            <w:tcW w:type="dxa" w:w="2160"/>
+          </w:tcPr>
+          <w:p>
+            <w:r/>
+            <w:r>
+              <w:rPr>
+                <w:rFonts w:ascii="Calibri" w:hAnsi="Calibri" w:eastAsia="Microsoft JhengHei"/>
+                <w:sz w:val="19"/>
+              </w:rPr>
+              <w:t>Export existing appliance data</w:t>
+            </w:r>
+          </w:p>
+        </w:tc>
+        <w:tc>
+          <w:tcPr>
+            <w:tcW w:type="dxa" w:w="2160"/>
+          </w:tcPr>
+          <w:p>
+            <w:r/>
+            <w:r>
+              <w:rPr>
+                <w:rFonts w:ascii="Calibri" w:hAnsi="Calibri" w:eastAsia="Microsoft JhengHei"/>
+                <w:sz w:val="19"/>
+              </w:rPr>
+              <w:t>從舊 8.0.3 匯出組態/資料</w:t>
+            </w:r>
+          </w:p>
+        </w:tc>
+        <w:tc>
+          <w:tcPr>
+            <w:tcW w:type="dxa" w:w="2160"/>
+          </w:tcPr>
+          <w:p>
+            <w:r/>
+            <w:r>
+              <w:rPr>
+                <w:rFonts w:ascii="Calibri" w:hAnsi="Calibri" w:eastAsia="Microsoft JhengHei"/>
+                <w:sz w:val="19"/>
+              </w:rPr>
+              <w:t>SUCCEEDED 100/100</w:t>
+            </w:r>
+          </w:p>
+        </w:tc>
+      </w:tr>
+      <w:tr>
+        <w:tc>
+          <w:tcPr>
+            <w:tcW w:type="dxa" w:w="2160"/>
+          </w:tcPr>
+          <w:p>
+            <w:r/>
+            <w:r>
+              <w:rPr>
+                <w:rFonts w:ascii="Calibri" w:hAnsi="Calibri" w:eastAsia="Microsoft JhengHei"/>
+                <w:sz w:val="19"/>
+              </w:rPr>
+              <w:t>5</w:t>
+            </w:r>
+          </w:p>
+        </w:tc>
+        <w:tc>
+          <w:tcPr>
+            <w:tcW w:type="dxa" w:w="2160"/>
+          </w:tcPr>
+          <w:p>
+            <w:r/>
+            <w:r>
+              <w:rPr>
+                <w:rFonts w:ascii="Calibri" w:hAnsi="Calibri" w:eastAsia="Microsoft JhengHei"/>
+                <w:sz w:val="19"/>
+              </w:rPr>
+              <w:t>Run firstboot scripts</w:t>
+            </w:r>
+          </w:p>
+        </w:tc>
+        <w:tc>
+          <w:tcPr>
+            <w:tcW w:type="dxa" w:w="2160"/>
+          </w:tcPr>
+          <w:p>
+            <w:r/>
+            <w:r>
+              <w:rPr>
+                <w:rFonts w:ascii="Calibri" w:hAnsi="Calibri" w:eastAsia="Microsoft JhengHei"/>
+                <w:sz w:val="19"/>
+              </w:rPr>
+              <w:t>新 appliance firstboot 起各服務</w:t>
+            </w:r>
+          </w:p>
+        </w:tc>
+        <w:tc>
+          <w:tcPr>
+            <w:tcW w:type="dxa" w:w="2160"/>
+          </w:tcPr>
+          <w:p>
+            <w:r/>
+            <w:r>
+              <w:rPr>
+                <w:rFonts w:ascii="Calibri" w:hAnsi="Calibri" w:eastAsia="Microsoft JhengHei"/>
+                <w:sz w:val="19"/>
+              </w:rPr>
+              <w:t>SUCCEEDED 100/100</w:t>
+            </w:r>
+          </w:p>
+        </w:tc>
+      </w:tr>
+      <w:tr>
+        <w:tc>
+          <w:tcPr>
+            <w:tcW w:type="dxa" w:w="2160"/>
+          </w:tcPr>
+          <w:p>
+            <w:r/>
+            <w:r>
+              <w:rPr>
+                <w:rFonts w:ascii="Calibri" w:hAnsi="Calibri" w:eastAsia="Microsoft JhengHei"/>
+                <w:sz w:val="19"/>
+              </w:rPr>
+              <w:t>6</w:t>
+            </w:r>
+          </w:p>
+        </w:tc>
+        <w:tc>
+          <w:tcPr>
+            <w:tcW w:type="dxa" w:w="2160"/>
+          </w:tcPr>
+          <w:p>
+            <w:r/>
+            <w:r>
+              <w:rPr>
+                <w:rFonts w:ascii="Calibri" w:hAnsi="Calibri" w:eastAsia="Microsoft JhengHei"/>
+                <w:sz w:val="19"/>
+              </w:rPr>
+              <w:t>Import data into appliance</w:t>
+            </w:r>
+          </w:p>
+        </w:tc>
+        <w:tc>
+          <w:tcPr>
+            <w:tcW w:type="dxa" w:w="2160"/>
+          </w:tcPr>
+          <w:p>
+            <w:r/>
+            <w:r>
+              <w:rPr>
+                <w:rFonts w:ascii="Calibri" w:hAnsi="Calibri" w:eastAsia="Microsoft JhengHei"/>
+                <w:sz w:val="19"/>
+              </w:rPr>
+              <w:t>把資料匯入新 9.1 appliance</w:t>
+            </w:r>
+          </w:p>
+        </w:tc>
+        <w:tc>
+          <w:tcPr>
+            <w:tcW w:type="dxa" w:w="2160"/>
+          </w:tcPr>
+          <w:p>
+            <w:r/>
+            <w:r>
+              <w:rPr>
+                <w:rFonts w:ascii="Calibri" w:hAnsi="Calibri" w:eastAsia="Microsoft JhengHei"/>
+                <w:sz w:val="19"/>
+              </w:rPr>
+              <w:t>SUCCEEDED 100/100</w:t>
+            </w:r>
+          </w:p>
+        </w:tc>
+      </w:tr>
+      <w:tr>
+        <w:tc>
+          <w:tcPr>
+            <w:tcW w:type="dxa" w:w="2160"/>
+          </w:tcPr>
+          <w:p>
+            <w:r/>
+            <w:r>
+              <w:rPr>
+                <w:rFonts w:ascii="Calibri" w:hAnsi="Calibri" w:eastAsia="Microsoft JhengHei"/>
+                <w:sz w:val="19"/>
+              </w:rPr>
+              <w:t>7</w:t>
+            </w:r>
+          </w:p>
+        </w:tc>
+        <w:tc>
+          <w:tcPr>
+            <w:tcW w:type="dxa" w:w="2160"/>
+          </w:tcPr>
+          <w:p>
+            <w:r/>
+            <w:r>
+              <w:rPr>
+                <w:rFonts w:ascii="Calibri" w:hAnsi="Calibri" w:eastAsia="Microsoft JhengHei"/>
+                <w:sz w:val="19"/>
+              </w:rPr>
+              <w:t>IP 切換 + 收尾</w:t>
+            </w:r>
+          </w:p>
+        </w:tc>
+        <w:tc>
+          <w:tcPr>
+            <w:tcW w:type="dxa" w:w="2160"/>
+          </w:tcPr>
+          <w:p>
+            <w:r/>
+            <w:r>
+              <w:rPr>
+                <w:rFonts w:ascii="Calibri" w:hAnsi="Calibri" w:eastAsia="Microsoft JhengHei"/>
+                <w:sz w:val="19"/>
+              </w:rPr>
+              <w:t>.151→.142、舊機關機、評估模式</w:t>
+            </w:r>
+          </w:p>
+        </w:tc>
+        <w:tc>
+          <w:tcPr>
+            <w:tcW w:type="dxa" w:w="2160"/>
+          </w:tcPr>
+          <w:p>
+            <w:r/>
+            <w:r>
+              <w:rPr>
+                <w:rFonts w:ascii="Calibri" w:hAnsi="Calibri" w:eastAsia="Microsoft JhengHei"/>
+                <w:sz w:val="19"/>
+              </w:rPr>
+              <w:t>Successfully completed</w:t>
+            </w:r>
+          </w:p>
+        </w:tc>
+      </w:tr>
+    </w:tbl>
+    <w:p>
       <w:pPr>
         <w:jc w:val="center"/>
       </w:pPr>
@@ -1626,7 +2151,7 @@
           <w:i/>
           <w:sz w:val="18"/>
         </w:rPr>
-        <w:t>圖：升級後：vCenter VAMI Summary — Version 9.1.0.0300 / Build 25629530，Health 全 Good，SSO Running</w:t>
+        <w:t>圖：升級後（結果驗證）：vCenter VAMI Summary — Version 9.1.0.0300 / Build 25629530，Health 全 Good，SSO Running</w:t>
       </w:r>
     </w:p>
     <w:p>

</xml_diff>